<commit_message>
docs: add content buffer section (Section 4), renumber sections 5-10
</commit_message>
<xml_diff>
--- a/docs/Vera_Level_FX_System_Documentation.docx
+++ b/docs/Vera_Level_FX_System_Documentation.docx
@@ -3847,7 +3847,7 @@
           <w:color w:val="010E1F"/>
           <w:sz w:val="36"/>
         </w:rPr>
-        <w:t>4. Educational Content Rotation (6-Week Cycle)</w:t>
+        <w:t>4. Content Buffer — Pre-Made Image Queue</w:t>
       </w:r>
     </w:p>
     <w:p>
@@ -3862,7 +3862,1057 @@
           <w:color w:val="010E1F"/>
           <w:sz w:val="26"/>
         </w:rPr>
-        <w:t>4.1  Rotation Structure</w:t>
+        <w:t>4.1  What It Is</w:t>
+      </w:r>
+    </w:p>
+    <w:p>
+      <w:pPr>
+        <w:spacing w:before="40" w:after="80"/>
+      </w:pPr>
+      <w:r>
+        <w:rPr>
+          <w:rFonts w:ascii="Calibri" w:hAnsi="Calibri"/>
+          <w:b w:val="0"/>
+          <w:i w:val="0"/>
+          <w:sz w:val="21"/>
+        </w:rPr>
+        <w:t>The content buffer is a set of folders on your laptop where you can drop pre-designed 1080×1080 PNG images during your free time. When the Instagram pipeline runs, it checks the buffer first. If a buffered image exists for that post type, it uses that instead of auto-generating one. If the buffer is empty, it falls back to auto-generation as normal.</w:t>
+      </w:r>
+    </w:p>
+    <w:p>
+      <w:pPr>
+        <w:spacing w:before="40" w:after="80"/>
+      </w:pPr>
+      <w:r>
+        <w:rPr>
+          <w:rFonts w:ascii="Calibri" w:hAnsi="Calibri"/>
+          <w:b w:val="0"/>
+          <w:i w:val="0"/>
+          <w:sz w:val="21"/>
+        </w:rPr>
+        <w:t>This lets you batch-create high-quality graphics (in Canva, on your phone, or any design tool) whenever you have spare time, then let the pipeline drain them automatically on schedule.</w:t>
+      </w:r>
+    </w:p>
+    <w:p>
+      <w:pPr>
+        <w:spacing w:before="240" w:after="80"/>
+      </w:pPr>
+      <w:r>
+        <w:rPr>
+          <w:rFonts w:ascii="Calibri" w:hAnsi="Calibri"/>
+          <w:b/>
+          <w:i w:val="0"/>
+          <w:color w:val="010E1F"/>
+          <w:sz w:val="26"/>
+        </w:rPr>
+        <w:t>4.2  Folder Structure</w:t>
+      </w:r>
+    </w:p>
+    <w:p>
+      <w:pPr>
+        <w:spacing w:before="40" w:after="80"/>
+      </w:pPr>
+      <w:r>
+        <w:rPr>
+          <w:rFonts w:ascii="Calibri" w:hAnsi="Calibri"/>
+          <w:b w:val="0"/>
+          <w:i w:val="0"/>
+          <w:sz w:val="21"/>
+        </w:rPr>
+        <w:t>Location: vera-level-fx/instagram/buffer/</w:t>
+      </w:r>
+    </w:p>
+    <w:tbl>
+      <w:tblPr>
+        <w:tblStyle w:val="TableGrid"/>
+        <w:tblW w:type="auto" w:w="0"/>
+        <w:jc w:val="left"/>
+        <w:tblLook w:firstColumn="1" w:firstRow="1" w:lastColumn="0" w:lastRow="0" w:noHBand="0" w:noVBand="1" w:val="04A0"/>
+      </w:tblPr>
+      <w:tblGrid>
+        <w:gridCol w:w="4703"/>
+        <w:gridCol w:w="4703"/>
+      </w:tblGrid>
+      <w:tr>
+        <w:tc>
+          <w:tcPr>
+            <w:tcW w:type="dxa" w:w="2835"/>
+            <w:shd w:val="clear" w:color="auto" w:fill="010E1F"/>
+          </w:tcPr>
+          <w:p>
+            <w:r>
+              <w:rPr>
+                <w:rFonts w:ascii="Calibri" w:hAnsi="Calibri"/>
+                <w:b/>
+                <w:i w:val="0"/>
+                <w:color w:val="FFFFFF"/>
+                <w:sz w:val="20"/>
+              </w:rPr>
+              <w:t>Folder</w:t>
+            </w:r>
+          </w:p>
+        </w:tc>
+        <w:tc>
+          <w:tcPr>
+            <w:tcW w:type="dxa" w:w="6236"/>
+            <w:shd w:val="clear" w:color="auto" w:fill="010E1F"/>
+          </w:tcPr>
+          <w:p>
+            <w:r>
+              <w:rPr>
+                <w:rFonts w:ascii="Calibri" w:hAnsi="Calibri"/>
+                <w:b/>
+                <w:i w:val="0"/>
+                <w:color w:val="FFFFFF"/>
+                <w:sz w:val="20"/>
+              </w:rPr>
+              <w:t>Purpose</w:t>
+            </w:r>
+          </w:p>
+        </w:tc>
+      </w:tr>
+      <w:tr>
+        <w:tc>
+          <w:tcPr>
+            <w:tcW w:type="dxa" w:w="2835"/>
+            <w:shd w:val="clear" w:color="auto" w:fill="F7F7F7"/>
+          </w:tcPr>
+          <w:p>
+            <w:r>
+              <w:rPr>
+                <w:rFonts w:ascii="Calibri" w:hAnsi="Calibri"/>
+                <w:b/>
+                <w:i w:val="0"/>
+                <w:sz w:val="20"/>
+              </w:rPr>
+              <w:t>buffer/daily/</w:t>
+            </w:r>
+          </w:p>
+        </w:tc>
+        <w:tc>
+          <w:tcPr>
+            <w:tcW w:type="dxa" w:w="6236"/>
+            <w:shd w:val="clear" w:color="auto" w:fill="F7F7F7"/>
+          </w:tcPr>
+          <w:p>
+            <w:r>
+              <w:rPr>
+                <w:rFonts w:ascii="Calibri" w:hAnsi="Calibri"/>
+                <w:b w:val="0"/>
+                <w:i w:val="0"/>
+                <w:sz w:val="20"/>
+              </w:rPr>
+              <w:t>Pre-made live position cards — used on Wednesday and Friday posts</w:t>
+            </w:r>
+          </w:p>
+        </w:tc>
+      </w:tr>
+      <w:tr>
+        <w:tc>
+          <w:tcPr>
+            <w:tcW w:type="dxa" w:w="2835"/>
+          </w:tcPr>
+          <w:p>
+            <w:r>
+              <w:rPr>
+                <w:rFonts w:ascii="Calibri" w:hAnsi="Calibri"/>
+                <w:b/>
+                <w:i w:val="0"/>
+                <w:sz w:val="20"/>
+              </w:rPr>
+              <w:t>buffer/weekly/</w:t>
+            </w:r>
+          </w:p>
+        </w:tc>
+        <w:tc>
+          <w:tcPr>
+            <w:tcW w:type="dxa" w:w="6236"/>
+          </w:tcPr>
+          <w:p>
+            <w:r>
+              <w:rPr>
+                <w:rFonts w:ascii="Calibri" w:hAnsi="Calibri"/>
+                <w:b w:val="0"/>
+                <w:i w:val="0"/>
+                <w:sz w:val="20"/>
+              </w:rPr>
+              <w:t>Pre-made weekly performance cards — used on Monday posts</w:t>
+            </w:r>
+          </w:p>
+        </w:tc>
+      </w:tr>
+      <w:tr>
+        <w:tc>
+          <w:tcPr>
+            <w:tcW w:type="dxa" w:w="2835"/>
+            <w:shd w:val="clear" w:color="auto" w:fill="F7F7F7"/>
+          </w:tcPr>
+          <w:p>
+            <w:r>
+              <w:rPr>
+                <w:rFonts w:ascii="Calibri" w:hAnsi="Calibri"/>
+                <w:b/>
+                <w:i w:val="0"/>
+                <w:sz w:val="20"/>
+              </w:rPr>
+              <w:t>buffer/monthly/</w:t>
+            </w:r>
+          </w:p>
+        </w:tc>
+        <w:tc>
+          <w:tcPr>
+            <w:tcW w:type="dxa" w:w="6236"/>
+            <w:shd w:val="clear" w:color="auto" w:fill="F7F7F7"/>
+          </w:tcPr>
+          <w:p>
+            <w:r>
+              <w:rPr>
+                <w:rFonts w:ascii="Calibri" w:hAnsi="Calibri"/>
+                <w:b w:val="0"/>
+                <w:i w:val="0"/>
+                <w:sz w:val="20"/>
+              </w:rPr>
+              <w:t>Pre-made monthly P&amp;L charts — used on 1st of month posts</w:t>
+            </w:r>
+          </w:p>
+        </w:tc>
+      </w:tr>
+      <w:tr>
+        <w:tc>
+          <w:tcPr>
+            <w:tcW w:type="dxa" w:w="2835"/>
+          </w:tcPr>
+          <w:p>
+            <w:r>
+              <w:rPr>
+                <w:rFonts w:ascii="Calibri" w:hAnsi="Calibri"/>
+                <w:b/>
+                <w:i w:val="0"/>
+                <w:sz w:val="20"/>
+              </w:rPr>
+              <w:t>buffer/trust/</w:t>
+            </w:r>
+          </w:p>
+        </w:tc>
+        <w:tc>
+          <w:tcPr>
+            <w:tcW w:type="dxa" w:w="6236"/>
+          </w:tcPr>
+          <w:p>
+            <w:r>
+              <w:rPr>
+                <w:rFonts w:ascii="Calibri" w:hAnsi="Calibri"/>
+                <w:b w:val="0"/>
+                <w:i w:val="0"/>
+                <w:sz w:val="20"/>
+              </w:rPr>
+              <w:t>Pre-made win rate / trust cards — used when post type is "trust"</w:t>
+            </w:r>
+          </w:p>
+        </w:tc>
+      </w:tr>
+      <w:tr>
+        <w:tc>
+          <w:tcPr>
+            <w:tcW w:type="dxa" w:w="2835"/>
+            <w:shd w:val="clear" w:color="auto" w:fill="F7F7F7"/>
+          </w:tcPr>
+          <w:p>
+            <w:r>
+              <w:rPr>
+                <w:rFonts w:ascii="Calibri" w:hAnsi="Calibri"/>
+                <w:b/>
+                <w:i w:val="0"/>
+                <w:sz w:val="20"/>
+              </w:rPr>
+              <w:t>buffer/edu/risk/</w:t>
+            </w:r>
+          </w:p>
+        </w:tc>
+        <w:tc>
+          <w:tcPr>
+            <w:tcW w:type="dxa" w:w="6236"/>
+            <w:shd w:val="clear" w:color="auto" w:fill="F7F7F7"/>
+          </w:tcPr>
+          <w:p>
+            <w:r>
+              <w:rPr>
+                <w:rFonts w:ascii="Calibri" w:hAnsi="Calibri"/>
+                <w:b w:val="0"/>
+                <w:i w:val="0"/>
+                <w:sz w:val="20"/>
+              </w:rPr>
+              <w:t>Pre-made risk management educational posts — Tue/Thu rotation</w:t>
+            </w:r>
+          </w:p>
+        </w:tc>
+      </w:tr>
+      <w:tr>
+        <w:tc>
+          <w:tcPr>
+            <w:tcW w:type="dxa" w:w="2835"/>
+          </w:tcPr>
+          <w:p>
+            <w:r>
+              <w:rPr>
+                <w:rFonts w:ascii="Calibri" w:hAnsi="Calibri"/>
+                <w:b/>
+                <w:i w:val="0"/>
+                <w:sz w:val="20"/>
+              </w:rPr>
+              <w:t>buffer/edu/pairs/</w:t>
+            </w:r>
+          </w:p>
+        </w:tc>
+        <w:tc>
+          <w:tcPr>
+            <w:tcW w:type="dxa" w:w="6236"/>
+          </w:tcPr>
+          <w:p>
+            <w:r>
+              <w:rPr>
+                <w:rFonts w:ascii="Calibri" w:hAnsi="Calibri"/>
+                <w:b w:val="0"/>
+                <w:i w:val="0"/>
+                <w:sz w:val="20"/>
+              </w:rPr>
+              <w:t>Pre-made pair spotlight educational posts — Tue/Thu rotation</w:t>
+            </w:r>
+          </w:p>
+        </w:tc>
+      </w:tr>
+      <w:tr>
+        <w:tc>
+          <w:tcPr>
+            <w:tcW w:type="dxa" w:w="2835"/>
+            <w:shd w:val="clear" w:color="auto" w:fill="F7F7F7"/>
+          </w:tcPr>
+          <w:p>
+            <w:r>
+              <w:rPr>
+                <w:rFonts w:ascii="Calibri" w:hAnsi="Calibri"/>
+                <w:b/>
+                <w:i w:val="0"/>
+                <w:sz w:val="20"/>
+              </w:rPr>
+              <w:t>buffer/edu/setup/</w:t>
+            </w:r>
+          </w:p>
+        </w:tc>
+        <w:tc>
+          <w:tcPr>
+            <w:tcW w:type="dxa" w:w="6236"/>
+            <w:shd w:val="clear" w:color="auto" w:fill="F7F7F7"/>
+          </w:tcPr>
+          <w:p>
+            <w:r>
+              <w:rPr>
+                <w:rFonts w:ascii="Calibri" w:hAnsi="Calibri"/>
+                <w:b w:val="0"/>
+                <w:i w:val="0"/>
+                <w:sz w:val="20"/>
+              </w:rPr>
+              <w:t>Pre-made trade setup breakdown posts — Tue/Thu rotation</w:t>
+            </w:r>
+          </w:p>
+        </w:tc>
+      </w:tr>
+    </w:tbl>
+    <w:p/>
+    <w:p>
+      <w:pPr>
+        <w:spacing w:before="240" w:after="80"/>
+      </w:pPr>
+      <w:r>
+        <w:rPr>
+          <w:rFonts w:ascii="Calibri" w:hAnsi="Calibri"/>
+          <w:b/>
+          <w:i w:val="0"/>
+          <w:color w:val="010E1F"/>
+          <w:sz w:val="26"/>
+        </w:rPr>
+        <w:t>4.3  How It Works</w:t>
+      </w:r>
+    </w:p>
+    <w:p>
+      <w:pPr>
+        <w:pStyle w:val="ListBullet"/>
+        <w:spacing w:before="20" w:after="20"/>
+        <w:ind w:left="283"/>
+      </w:pPr>
+      <w:r>
+        <w:rPr>
+          <w:rFonts w:ascii="Calibri" w:hAnsi="Calibri"/>
+          <w:b w:val="0"/>
+          <w:i w:val="0"/>
+          <w:sz w:val="21"/>
+        </w:rPr>
+        <w:t>Drop one or more 1080×1080 PNG files into the matching subfolder.</w:t>
+      </w:r>
+    </w:p>
+    <w:p>
+      <w:pPr>
+        <w:pStyle w:val="ListBullet"/>
+        <w:spacing w:before="20" w:after="20"/>
+        <w:ind w:left="283"/>
+      </w:pPr>
+      <w:r>
+        <w:rPr>
+          <w:rFonts w:ascii="Calibri" w:hAnsi="Calibri"/>
+          <w:b w:val="0"/>
+          <w:i w:val="0"/>
+          <w:sz w:val="21"/>
+        </w:rPr>
+        <w:t>Commit and push to GitHub.</w:t>
+      </w:r>
+    </w:p>
+    <w:p>
+      <w:pPr>
+        <w:pStyle w:val="ListBullet"/>
+        <w:spacing w:before="20" w:after="20"/>
+        <w:ind w:left="283"/>
+      </w:pPr>
+      <w:r>
+        <w:rPr>
+          <w:rFonts w:ascii="Calibri" w:hAnsi="Calibri"/>
+          <w:b w:val="0"/>
+          <w:i w:val="0"/>
+          <w:sz w:val="21"/>
+        </w:rPr>
+        <w:t>On the next scheduled post for that type, run.py calls pop_buffer() before generating.</w:t>
+      </w:r>
+    </w:p>
+    <w:p>
+      <w:pPr>
+        <w:pStyle w:val="ListBullet"/>
+        <w:spacing w:before="20" w:after="20"/>
+        <w:ind w:left="283"/>
+      </w:pPr>
+      <w:r>
+        <w:rPr>
+          <w:rFonts w:ascii="Calibri" w:hAnsi="Calibri"/>
+          <w:b w:val="0"/>
+          <w:i w:val="0"/>
+          <w:sz w:val="21"/>
+        </w:rPr>
+        <w:t>pop_buffer() picks the alphabetically oldest PNG from the folder (FIFO).</w:t>
+      </w:r>
+    </w:p>
+    <w:p>
+      <w:pPr>
+        <w:pStyle w:val="ListBullet"/>
+        <w:spacing w:before="20" w:after="20"/>
+        <w:ind w:left="283"/>
+      </w:pPr>
+      <w:r>
+        <w:rPr>
+          <w:rFonts w:ascii="Calibri" w:hAnsi="Calibri"/>
+          <w:b w:val="0"/>
+          <w:i w:val="0"/>
+          <w:sz w:val="21"/>
+        </w:rPr>
+        <w:t>The file is immediately moved to instagram/posts/YYYY-MM-DD-{type}-buffered.png — it will never be used twice.</w:t>
+      </w:r>
+    </w:p>
+    <w:p>
+      <w:pPr>
+        <w:pStyle w:val="ListBullet"/>
+        <w:spacing w:before="20" w:after="20"/>
+        <w:ind w:left="283"/>
+      </w:pPr>
+      <w:r>
+        <w:rPr>
+          <w:rFonts w:ascii="Calibri" w:hAnsi="Calibri"/>
+          <w:b w:val="0"/>
+          <w:i w:val="0"/>
+          <w:sz w:val="21"/>
+        </w:rPr>
+        <w:t>Caption is always generated live from the current vera-snapshot.json data — only the image is buffered.</w:t>
+      </w:r>
+    </w:p>
+    <w:p>
+      <w:pPr>
+        <w:pStyle w:val="ListBullet"/>
+        <w:spacing w:before="20" w:after="20"/>
+        <w:ind w:left="283"/>
+      </w:pPr>
+      <w:r>
+        <w:rPr>
+          <w:rFonts w:ascii="Calibri" w:hAnsi="Calibri"/>
+          <w:b w:val="0"/>
+          <w:i w:val="0"/>
+          <w:sz w:val="21"/>
+        </w:rPr>
+        <w:t>If the buffer folder is empty, the pipeline generates the image automatically as usual.</w:t>
+      </w:r>
+    </w:p>
+    <w:p>
+      <w:pPr>
+        <w:spacing w:before="80" w:after="160"/>
+        <w:ind w:left="283" w:right="283"/>
+        <w:shd w:val="clear" w:color="auto" w:fill="E8F4FD"/>
+      </w:pPr>
+      <w:r>
+        <w:rPr>
+          <w:rFonts w:ascii="Calibri" w:hAnsi="Calibri"/>
+          <w:b w:val="0"/>
+          <w:i/>
+          <w:sz w:val="20"/>
+        </w:rPr>
+        <w:t>💡  To control the order in which buffered images are used, prefix filenames with a number: "01_gold-setup.png", "02_eurusd-chart.png". They will be consumed in alphabetical order.</w:t>
+      </w:r>
+    </w:p>
+    <w:p>
+      <w:pPr>
+        <w:spacing w:before="240" w:after="80"/>
+      </w:pPr>
+      <w:r>
+        <w:rPr>
+          <w:rFonts w:ascii="Calibri" w:hAnsi="Calibri"/>
+          <w:b/>
+          <w:i w:val="0"/>
+          <w:color w:val="010E1F"/>
+          <w:sz w:val="26"/>
+        </w:rPr>
+        <w:t>4.4  Step-by-Step: Adding an Image to the Buffer</w:t>
+      </w:r>
+    </w:p>
+    <w:p>
+      <w:pPr>
+        <w:spacing w:before="40" w:after="80"/>
+      </w:pPr>
+      <w:r>
+        <w:rPr>
+          <w:rFonts w:ascii="Calibri" w:hAnsi="Calibri"/>
+          <w:b w:val="0"/>
+          <w:i w:val="0"/>
+          <w:sz w:val="21"/>
+        </w:rPr>
+        <w:t>From your laptop:</w:t>
+      </w:r>
+    </w:p>
+    <w:p>
+      <w:pPr>
+        <w:spacing w:before="0" w:after="0"/>
+        <w:ind w:left="454"/>
+        <w:shd w:val="clear" w:color="auto" w:fill="F2F2F2"/>
+      </w:pPr>
+      <w:r>
+        <w:rPr>
+          <w:rFonts w:ascii="Courier New" w:hAnsi="Courier New"/>
+          <w:b w:val="0"/>
+          <w:i w:val="0"/>
+          <w:color w:val="1A1A2E"/>
+          <w:sz w:val="18"/>
+        </w:rPr>
+        <w:t># 1. Copy your PNG into the correct subfolder:</w:t>
+      </w:r>
+    </w:p>
+    <w:p>
+      <w:pPr>
+        <w:spacing w:before="0" w:after="0"/>
+        <w:ind w:left="454"/>
+        <w:shd w:val="clear" w:color="auto" w:fill="F2F2F2"/>
+      </w:pPr>
+      <w:r>
+        <w:rPr>
+          <w:rFonts w:ascii="Courier New" w:hAnsi="Courier New"/>
+          <w:b w:val="0"/>
+          <w:i w:val="0"/>
+          <w:color w:val="1A1A2E"/>
+          <w:sz w:val="18"/>
+        </w:rPr>
+        <w:t>#    vera-level-fx\instagram\buffer\daily\my-chart-June.png</w:t>
+      </w:r>
+    </w:p>
+    <w:p>
+      <w:pPr>
+        <w:spacing w:before="0" w:after="0"/>
+        <w:ind w:left="454"/>
+        <w:shd w:val="clear" w:color="auto" w:fill="F2F2F2"/>
+      </w:pPr>
+      <w:r>
+        <w:rPr>
+          <w:rFonts w:ascii="Courier New" w:hAnsi="Courier New"/>
+          <w:b w:val="0"/>
+          <w:i w:val="0"/>
+          <w:color w:val="1A1A2E"/>
+          <w:sz w:val="18"/>
+        </w:rPr>
+        <w:t xml:space="preserve"> </w:t>
+      </w:r>
+    </w:p>
+    <w:p>
+      <w:pPr>
+        <w:spacing w:before="0" w:after="0"/>
+        <w:ind w:left="454"/>
+        <w:shd w:val="clear" w:color="auto" w:fill="F2F2F2"/>
+      </w:pPr>
+      <w:r>
+        <w:rPr>
+          <w:rFonts w:ascii="Courier New" w:hAnsi="Courier New"/>
+          <w:b w:val="0"/>
+          <w:i w:val="0"/>
+          <w:color w:val="1A1A2E"/>
+          <w:sz w:val="18"/>
+        </w:rPr>
+        <w:t># 2. Stage and commit:</w:t>
+      </w:r>
+    </w:p>
+    <w:p>
+      <w:pPr>
+        <w:spacing w:before="0" w:after="0"/>
+        <w:ind w:left="454"/>
+        <w:shd w:val="clear" w:color="auto" w:fill="F2F2F2"/>
+      </w:pPr>
+      <w:r>
+        <w:rPr>
+          <w:rFonts w:ascii="Courier New" w:hAnsi="Courier New"/>
+          <w:b w:val="0"/>
+          <w:i w:val="0"/>
+          <w:color w:val="1A1A2E"/>
+          <w:sz w:val="18"/>
+        </w:rPr>
+        <w:t>cd "C:\Users\USER\Downloads\04 - FX Trading\vera-level-fx"</w:t>
+      </w:r>
+    </w:p>
+    <w:p>
+      <w:pPr>
+        <w:spacing w:before="0" w:after="0"/>
+        <w:ind w:left="454"/>
+        <w:shd w:val="clear" w:color="auto" w:fill="F2F2F2"/>
+      </w:pPr>
+      <w:r>
+        <w:rPr>
+          <w:rFonts w:ascii="Courier New" w:hAnsi="Courier New"/>
+          <w:b w:val="0"/>
+          <w:i w:val="0"/>
+          <w:color w:val="1A1A2E"/>
+          <w:sz w:val="18"/>
+        </w:rPr>
+        <w:t>git add instagram/buffer/</w:t>
+      </w:r>
+    </w:p>
+    <w:p>
+      <w:pPr>
+        <w:spacing w:before="0" w:after="0"/>
+        <w:ind w:left="454"/>
+        <w:shd w:val="clear" w:color="auto" w:fill="F2F2F2"/>
+      </w:pPr>
+      <w:r>
+        <w:rPr>
+          <w:rFonts w:ascii="Courier New" w:hAnsi="Courier New"/>
+          <w:b w:val="0"/>
+          <w:i w:val="0"/>
+          <w:color w:val="1A1A2E"/>
+          <w:sz w:val="18"/>
+        </w:rPr>
+        <w:t>git commit -m "buffer: add daily chart for June"</w:t>
+      </w:r>
+    </w:p>
+    <w:p>
+      <w:pPr>
+        <w:spacing w:before="0" w:after="0"/>
+        <w:ind w:left="454"/>
+        <w:shd w:val="clear" w:color="auto" w:fill="F2F2F2"/>
+      </w:pPr>
+      <w:r>
+        <w:rPr>
+          <w:rFonts w:ascii="Courier New" w:hAnsi="Courier New"/>
+          <w:b w:val="0"/>
+          <w:i w:val="0"/>
+          <w:color w:val="1A1A2E"/>
+          <w:sz w:val="18"/>
+        </w:rPr>
+        <w:t>git push</w:t>
+      </w:r>
+    </w:p>
+    <w:p>
+      <w:pPr>
+        <w:spacing w:before="0" w:after="0"/>
+        <w:ind w:left="454"/>
+        <w:shd w:val="clear" w:color="auto" w:fill="F2F2F2"/>
+      </w:pPr>
+      <w:r>
+        <w:rPr>
+          <w:rFonts w:ascii="Courier New" w:hAnsi="Courier New"/>
+          <w:b w:val="0"/>
+          <w:i w:val="0"/>
+          <w:color w:val="1A1A2E"/>
+          <w:sz w:val="18"/>
+        </w:rPr>
+        <w:t xml:space="preserve"> </w:t>
+      </w:r>
+    </w:p>
+    <w:p>
+      <w:pPr>
+        <w:spacing w:before="0" w:after="0"/>
+        <w:ind w:left="454"/>
+        <w:shd w:val="clear" w:color="auto" w:fill="F2F2F2"/>
+      </w:pPr>
+      <w:r>
+        <w:rPr>
+          <w:rFonts w:ascii="Courier New" w:hAnsi="Courier New"/>
+          <w:b w:val="0"/>
+          <w:i w:val="0"/>
+          <w:color w:val="1A1A2E"/>
+          <w:sz w:val="18"/>
+        </w:rPr>
+        <w:t># 3. Done. The next Wednesday or Friday post will use your image.</w:t>
+      </w:r>
+    </w:p>
+    <w:p/>
+    <w:p>
+      <w:pPr>
+        <w:spacing w:before="240" w:after="80"/>
+      </w:pPr>
+      <w:r>
+        <w:rPr>
+          <w:rFonts w:ascii="Calibri" w:hAnsi="Calibri"/>
+          <w:b/>
+          <w:i w:val="0"/>
+          <w:color w:val="010E1F"/>
+          <w:sz w:val="26"/>
+        </w:rPr>
+        <w:t>4.5  Checking Buffer Status</w:t>
+      </w:r>
+    </w:p>
+    <w:p>
+      <w:pPr>
+        <w:spacing w:before="40" w:after="80"/>
+      </w:pPr>
+      <w:r>
+        <w:rPr>
+          <w:rFonts w:ascii="Calibri" w:hAnsi="Calibri"/>
+          <w:b w:val="0"/>
+          <w:i w:val="0"/>
+          <w:sz w:val="21"/>
+        </w:rPr>
+        <w:t>See what images are currently queued:</w:t>
+      </w:r>
+    </w:p>
+    <w:p>
+      <w:pPr>
+        <w:spacing w:before="0" w:after="0"/>
+        <w:ind w:left="454"/>
+        <w:shd w:val="clear" w:color="auto" w:fill="F2F2F2"/>
+      </w:pPr>
+      <w:r>
+        <w:rPr>
+          <w:rFonts w:ascii="Courier New" w:hAnsi="Courier New"/>
+          <w:b w:val="0"/>
+          <w:i w:val="0"/>
+          <w:color w:val="1A1A2E"/>
+          <w:sz w:val="18"/>
+        </w:rPr>
+        <w:t>ls vera-level-fx\instagram\buffer\daily\</w:t>
+      </w:r>
+    </w:p>
+    <w:p>
+      <w:pPr>
+        <w:spacing w:before="0" w:after="0"/>
+        <w:ind w:left="454"/>
+        <w:shd w:val="clear" w:color="auto" w:fill="F2F2F2"/>
+      </w:pPr>
+      <w:r>
+        <w:rPr>
+          <w:rFonts w:ascii="Courier New" w:hAnsi="Courier New"/>
+          <w:b w:val="0"/>
+          <w:i w:val="0"/>
+          <w:color w:val="1A1A2E"/>
+          <w:sz w:val="18"/>
+        </w:rPr>
+        <w:t>ls vera-level-fx\instagram\buffer\weekly\</w:t>
+      </w:r>
+    </w:p>
+    <w:p>
+      <w:pPr>
+        <w:spacing w:before="0" w:after="0"/>
+        <w:ind w:left="454"/>
+        <w:shd w:val="clear" w:color="auto" w:fill="F2F2F2"/>
+      </w:pPr>
+      <w:r>
+        <w:rPr>
+          <w:rFonts w:ascii="Courier New" w:hAnsi="Courier New"/>
+          <w:b w:val="0"/>
+          <w:i w:val="0"/>
+          <w:color w:val="1A1A2E"/>
+          <w:sz w:val="18"/>
+        </w:rPr>
+        <w:t>ls vera-level-fx\instagram\buffer\edu\risk\</w:t>
+      </w:r>
+    </w:p>
+    <w:p>
+      <w:pPr>
+        <w:spacing w:before="0" w:after="0"/>
+        <w:ind w:left="454"/>
+        <w:shd w:val="clear" w:color="auto" w:fill="F2F2F2"/>
+      </w:pPr>
+      <w:r>
+        <w:rPr>
+          <w:rFonts w:ascii="Courier New" w:hAnsi="Courier New"/>
+          <w:b w:val="0"/>
+          <w:i w:val="0"/>
+          <w:color w:val="1A1A2E"/>
+          <w:sz w:val="18"/>
+        </w:rPr>
+        <w:t># etc.</w:t>
+      </w:r>
+    </w:p>
+    <w:p/>
+    <w:p>
+      <w:pPr>
+        <w:spacing w:before="240" w:after="80"/>
+      </w:pPr>
+      <w:r>
+        <w:rPr>
+          <w:rFonts w:ascii="Calibri" w:hAnsi="Calibri"/>
+          <w:b/>
+          <w:i w:val="0"/>
+          <w:color w:val="010E1F"/>
+          <w:sz w:val="26"/>
+        </w:rPr>
+        <w:t>4.6  Buffer Logic in run.py</w:t>
+      </w:r>
+    </w:p>
+    <w:p>
+      <w:pPr>
+        <w:spacing w:before="40" w:after="80"/>
+      </w:pPr>
+      <w:r>
+        <w:rPr>
+          <w:rFonts w:ascii="Calibri" w:hAnsi="Calibri"/>
+          <w:b w:val="0"/>
+          <w:i w:val="0"/>
+          <w:sz w:val="21"/>
+        </w:rPr>
+        <w:t>The pop_buffer() function in instagram/run.py handles buffer consumption:</w:t>
+      </w:r>
+    </w:p>
+    <w:p>
+      <w:pPr>
+        <w:spacing w:before="0" w:after="0"/>
+        <w:ind w:left="454"/>
+        <w:shd w:val="clear" w:color="auto" w:fill="F2F2F2"/>
+      </w:pPr>
+      <w:r>
+        <w:rPr>
+          <w:rFonts w:ascii="Courier New" w:hAnsi="Courier New"/>
+          <w:b w:val="0"/>
+          <w:i w:val="0"/>
+          <w:color w:val="1A1A2E"/>
+          <w:sz w:val="18"/>
+        </w:rPr>
+        <w:t>def pop_buffer(post_type, edu_type=""):</w:t>
+      </w:r>
+    </w:p>
+    <w:p>
+      <w:pPr>
+        <w:spacing w:before="0" w:after="0"/>
+        <w:ind w:left="454"/>
+        <w:shd w:val="clear" w:color="auto" w:fill="F2F2F2"/>
+      </w:pPr>
+      <w:r>
+        <w:rPr>
+          <w:rFonts w:ascii="Courier New" w:hAnsi="Courier New"/>
+          <w:b w:val="0"/>
+          <w:i w:val="0"/>
+          <w:color w:val="1A1A2E"/>
+          <w:sz w:val="18"/>
+        </w:rPr>
+        <w:t xml:space="preserve">    folder = BUFFER_DIR / post_type          # e.g. buffer/daily/</w:t>
+      </w:r>
+    </w:p>
+    <w:p>
+      <w:pPr>
+        <w:spacing w:before="0" w:after="0"/>
+        <w:ind w:left="454"/>
+        <w:shd w:val="clear" w:color="auto" w:fill="F2F2F2"/>
+      </w:pPr>
+      <w:r>
+        <w:rPr>
+          <w:rFonts w:ascii="Courier New" w:hAnsi="Courier New"/>
+          <w:b w:val="0"/>
+          <w:i w:val="0"/>
+          <w:color w:val="1A1A2E"/>
+          <w:sz w:val="18"/>
+        </w:rPr>
+        <w:t xml:space="preserve">    if edu_type:</w:t>
+      </w:r>
+    </w:p>
+    <w:p>
+      <w:pPr>
+        <w:spacing w:before="0" w:after="0"/>
+        <w:ind w:left="454"/>
+        <w:shd w:val="clear" w:color="auto" w:fill="F2F2F2"/>
+      </w:pPr>
+      <w:r>
+        <w:rPr>
+          <w:rFonts w:ascii="Courier New" w:hAnsi="Courier New"/>
+          <w:b w:val="0"/>
+          <w:i w:val="0"/>
+          <w:color w:val="1A1A2E"/>
+          <w:sz w:val="18"/>
+        </w:rPr>
+        <w:t xml:space="preserve">        folder = BUFFER_DIR / "edu" / edu_type  # e.g. buffer/edu/risk/</w:t>
+      </w:r>
+    </w:p>
+    <w:p>
+      <w:pPr>
+        <w:spacing w:before="0" w:after="0"/>
+        <w:ind w:left="454"/>
+        <w:shd w:val="clear" w:color="auto" w:fill="F2F2F2"/>
+      </w:pPr>
+      <w:r>
+        <w:rPr>
+          <w:rFonts w:ascii="Courier New" w:hAnsi="Courier New"/>
+          <w:b w:val="0"/>
+          <w:i w:val="0"/>
+          <w:color w:val="1A1A2E"/>
+          <w:sz w:val="18"/>
+        </w:rPr>
+        <w:t xml:space="preserve">    pngs = sorted(folder.glob("*.png"))      # alphabetical order</w:t>
+      </w:r>
+    </w:p>
+    <w:p>
+      <w:pPr>
+        <w:spacing w:before="0" w:after="0"/>
+        <w:ind w:left="454"/>
+        <w:shd w:val="clear" w:color="auto" w:fill="F2F2F2"/>
+      </w:pPr>
+      <w:r>
+        <w:rPr>
+          <w:rFonts w:ascii="Courier New" w:hAnsi="Courier New"/>
+          <w:b w:val="0"/>
+          <w:i w:val="0"/>
+          <w:color w:val="1A1A2E"/>
+          <w:sz w:val="18"/>
+        </w:rPr>
+        <w:t xml:space="preserve">    if not pngs:</w:t>
+      </w:r>
+    </w:p>
+    <w:p>
+      <w:pPr>
+        <w:spacing w:before="0" w:after="0"/>
+        <w:ind w:left="454"/>
+        <w:shd w:val="clear" w:color="auto" w:fill="F2F2F2"/>
+      </w:pPr>
+      <w:r>
+        <w:rPr>
+          <w:rFonts w:ascii="Courier New" w:hAnsi="Courier New"/>
+          <w:b w:val="0"/>
+          <w:i w:val="0"/>
+          <w:color w:val="1A1A2E"/>
+          <w:sz w:val="18"/>
+        </w:rPr>
+        <w:t xml:space="preserve">        return None                           # buffer empty → auto-generate</w:t>
+      </w:r>
+    </w:p>
+    <w:p>
+      <w:pPr>
+        <w:spacing w:before="0" w:after="0"/>
+        <w:ind w:left="454"/>
+        <w:shd w:val="clear" w:color="auto" w:fill="F2F2F2"/>
+      </w:pPr>
+      <w:r>
+        <w:rPr>
+          <w:rFonts w:ascii="Courier New" w:hAnsi="Courier New"/>
+          <w:b w:val="0"/>
+          <w:i w:val="0"/>
+          <w:color w:val="1A1A2E"/>
+          <w:sz w:val="18"/>
+        </w:rPr>
+        <w:t xml:space="preserve">    src = pngs[0]                             # oldest file</w:t>
+      </w:r>
+    </w:p>
+    <w:p>
+      <w:pPr>
+        <w:spacing w:before="0" w:after="0"/>
+        <w:ind w:left="454"/>
+        <w:shd w:val="clear" w:color="auto" w:fill="F2F2F2"/>
+      </w:pPr>
+      <w:r>
+        <w:rPr>
+          <w:rFonts w:ascii="Courier New" w:hAnsi="Courier New"/>
+          <w:b w:val="0"/>
+          <w:i w:val="0"/>
+          <w:color w:val="1A1A2E"/>
+          <w:sz w:val="18"/>
+        </w:rPr>
+        <w:t xml:space="preserve">    dst = OUT_DIR / f"{today}-{post_type}-buffered.png"</w:t>
+      </w:r>
+    </w:p>
+    <w:p>
+      <w:pPr>
+        <w:spacing w:before="0" w:after="0"/>
+        <w:ind w:left="454"/>
+        <w:shd w:val="clear" w:color="auto" w:fill="F2F2F2"/>
+      </w:pPr>
+      <w:r>
+        <w:rPr>
+          <w:rFonts w:ascii="Courier New" w:hAnsi="Courier New"/>
+          <w:b w:val="0"/>
+          <w:i w:val="0"/>
+          <w:color w:val="1A1A2E"/>
+          <w:sz w:val="18"/>
+        </w:rPr>
+        <w:t xml:space="preserve">    src.rename(dst)                           # move out of buffer</w:t>
+      </w:r>
+    </w:p>
+    <w:p>
+      <w:pPr>
+        <w:spacing w:before="0" w:after="0"/>
+        <w:ind w:left="454"/>
+        <w:shd w:val="clear" w:color="auto" w:fill="F2F2F2"/>
+      </w:pPr>
+      <w:r>
+        <w:rPr>
+          <w:rFonts w:ascii="Courier New" w:hAnsi="Courier New"/>
+          <w:b w:val="0"/>
+          <w:i w:val="0"/>
+          <w:color w:val="1A1A2E"/>
+          <w:sz w:val="18"/>
+        </w:rPr>
+        <w:t xml:space="preserve">    return dst                                # pipeline uses this path</w:t>
+      </w:r>
+    </w:p>
+    <w:p/>
+    <w:p>
+      <w:r>
+        <w:br w:type="page"/>
+      </w:r>
+    </w:p>
+    <w:p>
+      <w:pPr>
+        <w:spacing w:before="360" w:after="120"/>
+        <w:pBdr>
+          <w:bottom w:val="single" w:sz="8" w:space="4" w:color="F0C040"/>
+        </w:pBdr>
+      </w:pPr>
+      <w:r>
+        <w:rPr>
+          <w:rFonts w:ascii="Calibri" w:hAnsi="Calibri"/>
+          <w:b/>
+          <w:i w:val="0"/>
+          <w:color w:val="010E1F"/>
+          <w:sz w:val="36"/>
+        </w:rPr>
+        <w:t>5. Educational Content Rotation (6-Week Cycle)</w:t>
+      </w:r>
+    </w:p>
+    <w:p>
+      <w:pPr>
+        <w:spacing w:before="240" w:after="80"/>
+      </w:pPr>
+      <w:r>
+        <w:rPr>
+          <w:rFonts w:ascii="Calibri" w:hAnsi="Calibri"/>
+          <w:b/>
+          <w:i w:val="0"/>
+          <w:color w:val="010E1F"/>
+          <w:sz w:val="26"/>
+        </w:rPr>
+        <w:t>5.1  Rotation Structure</w:t>
       </w:r>
     </w:p>
     <w:p>
@@ -4362,7 +5412,7 @@
           <w:color w:val="010E1F"/>
           <w:sz w:val="26"/>
         </w:rPr>
-        <w:t>4.2  Counter File</w:t>
+        <w:t>5.2  Counter File</w:t>
       </w:r>
     </w:p>
     <w:p>
@@ -4471,7 +5521,7 @@
           <w:color w:val="010E1F"/>
           <w:sz w:val="36"/>
         </w:rPr>
-        <w:t>5. GitHub Actions Workflow</w:t>
+        <w:t>6. GitHub Actions Workflow</w:t>
       </w:r>
     </w:p>
     <w:p>
@@ -4486,7 +5536,7 @@
           <w:color w:val="010E1F"/>
           <w:sz w:val="26"/>
         </w:rPr>
-        <w:t>5.1  Workflow File</w:t>
+        <w:t>6.1  Workflow File</w:t>
       </w:r>
     </w:p>
     <w:p>
@@ -4669,7 +5719,7 @@
           <w:color w:val="010E1F"/>
           <w:sz w:val="26"/>
         </w:rPr>
-        <w:t>5.2  Workflow Steps</w:t>
+        <w:t>6.2  Workflow Steps</w:t>
       </w:r>
     </w:p>
     <w:tbl>
@@ -4911,7 +5961,7 @@
           <w:color w:val="010E1F"/>
           <w:sz w:val="26"/>
         </w:rPr>
-        <w:t>5.3  Manual Trigger (workflow_dispatch)</w:t>
+        <w:t>6.3  Manual Trigger (workflow_dispatch)</w:t>
       </w:r>
     </w:p>
     <w:p>
@@ -5167,7 +6217,7 @@
           <w:color w:val="010E1F"/>
           <w:sz w:val="26"/>
         </w:rPr>
-        <w:t>5.4  Required GitHub Secrets</w:t>
+        <w:t>6.4  Required GitHub Secrets</w:t>
       </w:r>
     </w:p>
     <w:tbl>
@@ -5363,7 +6413,7 @@
           <w:color w:val="010E1F"/>
           <w:sz w:val="36"/>
         </w:rPr>
-        <w:t>6. End-to-End Posting Flow (Step by Step)</w:t>
+        <w:t>7. End-to-End Posting Flow (Step by Step)</w:t>
       </w:r>
     </w:p>
     <w:p>
@@ -6150,7 +7200,7 @@
           <w:color w:val="010E1F"/>
           <w:sz w:val="36"/>
         </w:rPr>
-        <w:t>7. Security &amp; Credentials</w:t>
+        <w:t>8. Security &amp; Credentials</w:t>
       </w:r>
     </w:p>
     <w:p>
@@ -6165,7 +7215,7 @@
           <w:color w:val="010E1F"/>
           <w:sz w:val="26"/>
         </w:rPr>
-        <w:t>7.1  What Is Kept Secret</w:t>
+        <w:t>8.1  What Is Kept Secret</w:t>
       </w:r>
     </w:p>
     <w:tbl>
@@ -6441,7 +7491,7 @@
           <w:color w:val="010E1F"/>
           <w:sz w:val="26"/>
         </w:rPr>
-        <w:t>7.2  What Is Public</w:t>
+        <w:t>8.2  What Is Public</w:t>
       </w:r>
     </w:p>
     <w:p>
@@ -6504,7 +7554,7 @@
           <w:color w:val="010E1F"/>
           <w:sz w:val="26"/>
         </w:rPr>
-        <w:t>7.3  Brand Name Protection</w:t>
+        <w:t>8.3  Brand Name Protection</w:t>
       </w:r>
     </w:p>
     <w:p>
@@ -6644,7 +7694,7 @@
           <w:color w:val="010E1F"/>
           <w:sz w:val="36"/>
         </w:rPr>
-        <w:t>8. Troubleshooting</w:t>
+        <w:t>9. Troubleshooting</w:t>
       </w:r>
     </w:p>
     <w:p>
@@ -6659,7 +7709,7 @@
           <w:color w:val="010E1F"/>
           <w:sz w:val="26"/>
         </w:rPr>
-        <w:t>8.1  Scraper / Data Issues</w:t>
+        <w:t>9.1  Scraper / Data Issues</w:t>
       </w:r>
     </w:p>
     <w:tbl>
@@ -6901,7 +7951,7 @@
           <w:color w:val="010E1F"/>
           <w:sz w:val="26"/>
         </w:rPr>
-        <w:t>8.2  Instagram Pipeline Issues</w:t>
+        <w:t>9.2  Instagram Pipeline Issues</w:t>
       </w:r>
     </w:p>
     <w:tbl>
@@ -7163,6 +8213,76 @@
           </w:p>
         </w:tc>
       </w:tr>
+      <w:tr>
+        <w:tc>
+          <w:tcPr>
+            <w:tcW w:type="dxa" w:w="2835"/>
+            <w:shd w:val="clear" w:color="auto" w:fill="F7F7F7"/>
+          </w:tcPr>
+          <w:p>
+            <w:r>
+              <w:rPr>
+                <w:rFonts w:ascii="Calibri" w:hAnsi="Calibri"/>
+                <w:b/>
+                <w:i w:val="0"/>
+                <w:sz w:val="20"/>
+              </w:rPr>
+              <w:t>Buffered image not being used</w:t>
+            </w:r>
+          </w:p>
+        </w:tc>
+        <w:tc>
+          <w:tcPr>
+            <w:tcW w:type="dxa" w:w="6236"/>
+            <w:shd w:val="clear" w:color="auto" w:fill="F7F7F7"/>
+          </w:tcPr>
+          <w:p>
+            <w:r>
+              <w:rPr>
+                <w:rFonts w:ascii="Calibri" w:hAnsi="Calibri"/>
+                <w:b w:val="0"/>
+                <w:i w:val="0"/>
+                <w:sz w:val="20"/>
+              </w:rPr>
+              <w:t>Check the file is a .png (not .jpg or .PNG) and is in the correct subfolder. Run "ls instagram/buffer/daily/" to confirm. Also check git push succeeded so GitHub Actions can see the file.</w:t>
+            </w:r>
+          </w:p>
+        </w:tc>
+      </w:tr>
+      <w:tr>
+        <w:tc>
+          <w:tcPr>
+            <w:tcW w:type="dxa" w:w="2835"/>
+          </w:tcPr>
+          <w:p>
+            <w:r>
+              <w:rPr>
+                <w:rFonts w:ascii="Calibri" w:hAnsi="Calibri"/>
+                <w:b/>
+                <w:i w:val="0"/>
+                <w:sz w:val="20"/>
+              </w:rPr>
+              <w:t>Wrong image used from buffer</w:t>
+            </w:r>
+          </w:p>
+        </w:tc>
+        <w:tc>
+          <w:tcPr>
+            <w:tcW w:type="dxa" w:w="6236"/>
+          </w:tcPr>
+          <w:p>
+            <w:r>
+              <w:rPr>
+                <w:rFonts w:ascii="Calibri" w:hAnsi="Calibri"/>
+                <w:b w:val="0"/>
+                <w:i w:val="0"/>
+                <w:sz w:val="20"/>
+              </w:rPr>
+              <w:t>Buffer is FIFO — rename files with "01_", "02_" prefixes to control order. Or delete/archive unwanted files from the buffer folder and push again.</w:t>
+            </w:r>
+          </w:p>
+        </w:tc>
+      </w:tr>
     </w:tbl>
     <w:p/>
     <w:p>
@@ -7177,7 +8297,7 @@
           <w:color w:val="010E1F"/>
           <w:sz w:val="26"/>
         </w:rPr>
-        <w:t>8.3  Manual Commands</w:t>
+        <w:t>9.3  Manual Commands</w:t>
       </w:r>
     </w:p>
     <w:p>
@@ -7500,7 +8620,7 @@
           <w:color w:val="010E1F"/>
           <w:sz w:val="36"/>
         </w:rPr>
-        <w:t>9. Maintenance Checklist</w:t>
+        <w:t>10. Maintenance Checklist</w:t>
       </w:r>
     </w:p>
     <w:p>
@@ -7690,6 +8810,38 @@
           <w:sz w:val="21"/>
         </w:rPr>
         <w:t>If background photo (bg-daily-notepad.jpg) needs updating, replace the asset and verify overlay positions still align in generate_status.py.</w:t>
+      </w:r>
+    </w:p>
+    <w:p>
+      <w:pPr>
+        <w:pStyle w:val="ListBullet"/>
+        <w:spacing w:before="20" w:after="20"/>
+        <w:ind w:left="283"/>
+      </w:pPr>
+      <w:r>
+        <w:rPr>
+          <w:rFonts w:ascii="Calibri" w:hAnsi="Calibri"/>
+          <w:b w:val="0"/>
+          <w:i w:val="0"/>
+          <w:sz w:val="21"/>
+        </w:rPr>
+        <w:t>Top up the content buffer (instagram/buffer/) with fresh pre-made images whenever you have design time — aim to keep at least 2–3 images queued per post type.</w:t>
+      </w:r>
+    </w:p>
+    <w:p>
+      <w:pPr>
+        <w:pStyle w:val="ListBullet"/>
+        <w:spacing w:before="20" w:after="20"/>
+        <w:ind w:left="283"/>
+      </w:pPr>
+      <w:r>
+        <w:rPr>
+          <w:rFonts w:ascii="Calibri" w:hAnsi="Calibri"/>
+          <w:b w:val="0"/>
+          <w:i w:val="0"/>
+          <w:sz w:val="21"/>
+        </w:rPr>
+        <w:t>Archive used buffer images from instagram/posts/*-buffered.png if you want to review what was posted.</w:t>
       </w:r>
     </w:p>
     <w:p>

</xml_diff>

<commit_message>
docs: update with QR overlay, ENTRY column, CTA URLs, and referral campaign
</commit_message>
<xml_diff>
--- a/docs/Vera_Level_FX_System_Documentation.docx
+++ b/docs/Vera_Level_FX_System_Documentation.docx
@@ -709,6 +709,41 @@
                 <w:i w:val="0"/>
                 <w:sz w:val="20"/>
               </w:rPr>
+              <w:t>vera-level-fx/instagram/assets/qr-icmarkets.jpg</w:t>
+            </w:r>
+          </w:p>
+        </w:tc>
+        <w:tc>
+          <w:tcPr>
+            <w:tcW w:type="dxa" w:w="5102"/>
+            <w:shd w:val="clear" w:color="auto" w:fill="F7F7F7"/>
+          </w:tcPr>
+          <w:p>
+            <w:r>
+              <w:rPr>
+                <w:rFonts w:ascii="Calibri" w:hAnsi="Calibri"/>
+                <w:b w:val="0"/>
+                <w:i w:val="0"/>
+                <w:sz w:val="20"/>
+              </w:rPr>
+              <w:t>IC Markets referral QR code — stamped onto every post image before publishing</w:t>
+            </w:r>
+          </w:p>
+        </w:tc>
+      </w:tr>
+      <w:tr>
+        <w:tc>
+          <w:tcPr>
+            <w:tcW w:type="dxa" w:w="3969"/>
+          </w:tcPr>
+          <w:p>
+            <w:r>
+              <w:rPr>
+                <w:rFonts w:ascii="Calibri" w:hAnsi="Calibri"/>
+                <w:b/>
+                <w:i w:val="0"/>
+                <w:sz w:val="20"/>
+              </w:rPr>
               <w:t>vera-level-fx/instagram/generate.py</w:t>
             </w:r>
           </w:p>
@@ -716,7 +751,6 @@
         <w:tc>
           <w:tcPr>
             <w:tcW w:type="dxa" w:w="5102"/>
-            <w:shd w:val="clear" w:color="auto" w:fill="F7F7F7"/>
           </w:tcPr>
           <w:p>
             <w:r>
@@ -735,6 +769,7 @@
         <w:tc>
           <w:tcPr>
             <w:tcW w:type="dxa" w:w="3969"/>
+            <w:shd w:val="clear" w:color="auto" w:fill="F7F7F7"/>
           </w:tcPr>
           <w:p>
             <w:r>
@@ -751,6 +786,7 @@
         <w:tc>
           <w:tcPr>
             <w:tcW w:type="dxa" w:w="5102"/>
+            <w:shd w:val="clear" w:color="auto" w:fill="F7F7F7"/>
           </w:tcPr>
           <w:p>
             <w:r>
@@ -769,7 +805,6 @@
         <w:tc>
           <w:tcPr>
             <w:tcW w:type="dxa" w:w="3969"/>
-            <w:shd w:val="clear" w:color="auto" w:fill="F7F7F7"/>
           </w:tcPr>
           <w:p>
             <w:r>
@@ -786,7 +821,6 @@
         <w:tc>
           <w:tcPr>
             <w:tcW w:type="dxa" w:w="5102"/>
-            <w:shd w:val="clear" w:color="auto" w:fill="F7F7F7"/>
           </w:tcPr>
           <w:p>
             <w:r>
@@ -805,6 +839,7 @@
         <w:tc>
           <w:tcPr>
             <w:tcW w:type="dxa" w:w="3969"/>
+            <w:shd w:val="clear" w:color="auto" w:fill="F7F7F7"/>
           </w:tcPr>
           <w:p>
             <w:r>
@@ -821,6 +856,7 @@
         <w:tc>
           <w:tcPr>
             <w:tcW w:type="dxa" w:w="5102"/>
+            <w:shd w:val="clear" w:color="auto" w:fill="F7F7F7"/>
           </w:tcPr>
           <w:p>
             <w:r>
@@ -839,7 +875,6 @@
         <w:tc>
           <w:tcPr>
             <w:tcW w:type="dxa" w:w="3969"/>
-            <w:shd w:val="clear" w:color="auto" w:fill="F7F7F7"/>
           </w:tcPr>
           <w:p>
             <w:r>
@@ -856,7 +891,6 @@
         <w:tc>
           <w:tcPr>
             <w:tcW w:type="dxa" w:w="5102"/>
-            <w:shd w:val="clear" w:color="auto" w:fill="F7F7F7"/>
           </w:tcPr>
           <w:p>
             <w:r>
@@ -875,6 +909,7 @@
         <w:tc>
           <w:tcPr>
             <w:tcW w:type="dxa" w:w="3969"/>
+            <w:shd w:val="clear" w:color="auto" w:fill="F7F7F7"/>
           </w:tcPr>
           <w:p>
             <w:r>
@@ -891,6 +926,7 @@
         <w:tc>
           <w:tcPr>
             <w:tcW w:type="dxa" w:w="5102"/>
+            <w:shd w:val="clear" w:color="auto" w:fill="F7F7F7"/>
           </w:tcPr>
           <w:p>
             <w:r>
@@ -909,7 +945,6 @@
         <w:tc>
           <w:tcPr>
             <w:tcW w:type="dxa" w:w="3969"/>
-            <w:shd w:val="clear" w:color="auto" w:fill="F7F7F7"/>
           </w:tcPr>
           <w:p>
             <w:r>
@@ -926,7 +961,6 @@
         <w:tc>
           <w:tcPr>
             <w:tcW w:type="dxa" w:w="5102"/>
-            <w:shd w:val="clear" w:color="auto" w:fill="F7F7F7"/>
           </w:tcPr>
           <w:p>
             <w:r>
@@ -3118,7 +3152,7 @@
           <w:i w:val="0"/>
           <w:sz w:val="21"/>
         </w:rPr>
-        <w:t>Background: a photograph of an open notebook on a desk with a MacBook showing a trading chart. The left page of the notebook is used as the "writing surface" for trade data.</w:t>
+        <w:t>Background: a photograph of an open notebook on a desk with a MacBook showing a trading chart. The table spans the full image width (x 0.05–0.95), centred at the midpoint.</w:t>
       </w:r>
     </w:p>
     <w:p>
@@ -3134,7 +3168,7 @@
           <w:i w:val="0"/>
           <w:sz w:val="21"/>
         </w:rPr>
-        <w:t>A dark semi-transparent overlay (alpha 0.62) covers the laptop area at the top of the image.</w:t>
+        <w:t>A dark semi-transparent overlay (alpha 0.62) covers the laptop/keyboard area at the top of the image.</w:t>
       </w:r>
     </w:p>
     <w:p>
@@ -3166,7 +3200,7 @@
           <w:i w:val="0"/>
           <w:sz w:val="21"/>
         </w:rPr>
-        <w:t>Trade data is rendered in INK colour (#0A1628) directly onto the white left page of the notebook.</w:t>
+        <w:t>Trade data is rendered in INK colour (#0A1628) directly onto the white notebook page.</w:t>
       </w:r>
     </w:p>
     <w:p>
@@ -3182,7 +3216,23 @@
           <w:i w:val="0"/>
           <w:sz w:val="21"/>
         </w:rPr>
-        <w:t>Up to 5 open positions shown: pair, direction (BUY/SELL), P&amp;L in USD, pips, open date.</w:t>
+        <w:t>Up to 5 open positions shown: PAIR · DIR · P&amp;L (USD) · PIPS · ENTRY (open price).</w:t>
+      </w:r>
+    </w:p>
+    <w:p>
+      <w:pPr>
+        <w:pStyle w:val="ListBullet"/>
+        <w:spacing w:before="20" w:after="20"/>
+        <w:ind w:left="283"/>
+      </w:pPr>
+      <w:r>
+        <w:rPr>
+          <w:rFonts w:ascii="Calibri" w:hAnsi="Calibri"/>
+          <w:b w:val="0"/>
+          <w:i w:val="0"/>
+          <w:sz w:val="21"/>
+        </w:rPr>
+        <w:t>ENTRY price formatted as 4 decimal places for FX pairs (e.g. 1.1829), 2 decimal places for instruments ≥ 10 (e.g. 4089.47 for XAUUSD).</w:t>
       </w:r>
     </w:p>
     <w:p>
@@ -3214,7 +3264,7 @@
           <w:i w:val="0"/>
           <w:sz w:val="21"/>
         </w:rPr>
-        <w:t>Stats footer: win rate, profit factor, total pips.</w:t>
+        <w:t>Stats footer: win rate, profit factor, total pips — centred across full width.</w:t>
       </w:r>
     </w:p>
     <w:p>
@@ -3332,6 +3382,131 @@
           <w:color w:val="444466"/>
           <w:sz w:val="22"/>
         </w:rPr>
+        <w:t>IC Markets Referral QR Code Overlay (run.py — overlay_qr)</w:t>
+      </w:r>
+    </w:p>
+    <w:p>
+      <w:pPr>
+        <w:spacing w:before="40" w:after="80"/>
+      </w:pPr>
+      <w:r>
+        <w:rPr>
+          <w:rFonts w:ascii="Calibri" w:hAnsi="Calibri"/>
+          <w:b w:val="0"/>
+          <w:i w:val="0"/>
+          <w:sz w:val="21"/>
+        </w:rPr>
+        <w:t>After every image is generated (or retrieved from the buffer), run.py stamps the IC Markets referral QR code into the bottom-right corner of the PNG before committing and publishing.</w:t>
+      </w:r>
+    </w:p>
+    <w:p>
+      <w:pPr>
+        <w:pStyle w:val="ListBullet"/>
+        <w:spacing w:before="20" w:after="20"/>
+        <w:ind w:left="283"/>
+      </w:pPr>
+      <w:r>
+        <w:rPr>
+          <w:rFonts w:ascii="Calibri" w:hAnsi="Calibri"/>
+          <w:b w:val="0"/>
+          <w:i w:val="0"/>
+          <w:sz w:val="21"/>
+        </w:rPr>
+        <w:t>QR code asset: instagram/assets/qr-icmarkets.jpg (100×100 RGBA source).</w:t>
+      </w:r>
+    </w:p>
+    <w:p>
+      <w:pPr>
+        <w:pStyle w:val="ListBullet"/>
+        <w:spacing w:before="20" w:after="20"/>
+        <w:ind w:left="283"/>
+      </w:pPr>
+      <w:r>
+        <w:rPr>
+          <w:rFonts w:ascii="Calibri" w:hAnsi="Calibri"/>
+          <w:b w:val="0"/>
+          <w:i w:val="0"/>
+          <w:sz w:val="21"/>
+        </w:rPr>
+        <w:t>Resized to ~154px on a 1080 canvas (1/7th of image width) — large enough to scan from a phone screen.</w:t>
+      </w:r>
+    </w:p>
+    <w:p>
+      <w:pPr>
+        <w:pStyle w:val="ListBullet"/>
+        <w:spacing w:before="20" w:after="20"/>
+        <w:ind w:left="283"/>
+      </w:pPr>
+      <w:r>
+        <w:rPr>
+          <w:rFonts w:ascii="Calibri" w:hAnsi="Calibri"/>
+          <w:b w:val="0"/>
+          <w:i w:val="0"/>
+          <w:sz w:val="21"/>
+        </w:rPr>
+        <w:t>Placed on a white semi-transparent background (alpha 235) with 10px padding for contrast on any card colour.</w:t>
+      </w:r>
+    </w:p>
+    <w:p>
+      <w:pPr>
+        <w:pStyle w:val="ListBullet"/>
+        <w:spacing w:before="20" w:after="20"/>
+        <w:ind w:left="283"/>
+      </w:pPr>
+      <w:r>
+        <w:rPr>
+          <w:rFonts w:ascii="Calibri" w:hAnsi="Calibri"/>
+          <w:b w:val="0"/>
+          <w:i w:val="0"/>
+          <w:sz w:val="21"/>
+        </w:rPr>
+        <w:t>Positioned 18px from the right edge and 28px from the bottom — avoids cutting off by Instagram's rounded corners.</w:t>
+      </w:r>
+    </w:p>
+    <w:p>
+      <w:pPr>
+        <w:pStyle w:val="ListBullet"/>
+        <w:spacing w:before="20" w:after="20"/>
+        <w:ind w:left="283"/>
+      </w:pPr>
+      <w:r>
+        <w:rPr>
+          <w:rFonts w:ascii="Calibri" w:hAnsi="Calibri"/>
+          <w:b w:val="0"/>
+          <w:i w:val="0"/>
+          <w:sz w:val="21"/>
+        </w:rPr>
+        <w:t>Links to: https://icmarkets.com/?camp=91936 — IB referral campaign #91936.</w:t>
+      </w:r>
+    </w:p>
+    <w:p>
+      <w:pPr>
+        <w:pStyle w:val="ListBullet"/>
+        <w:spacing w:before="20" w:after="20"/>
+        <w:ind w:left="283"/>
+      </w:pPr>
+      <w:r>
+        <w:rPr>
+          <w:rFonts w:ascii="Calibri" w:hAnsi="Calibri"/>
+          <w:b w:val="0"/>
+          <w:i w:val="0"/>
+          <w:sz w:val="21"/>
+        </w:rPr>
+        <w:t>If the QR asset is missing or Pillow fails, the overlay step is skipped silently — the post still publishes.</w:t>
+      </w:r>
+    </w:p>
+    <w:p>
+      <w:pPr>
+        <w:spacing w:before="160" w:after="40"/>
+      </w:pPr>
+      <w:r>
+        <w:rPr>
+          <w:rFonts w:ascii="Calibri" w:hAnsi="Calibri"/>
+          <w:b/>
+          <w:i w:val="0"/>
+          <w:color w:val="444466"/>
+          <w:sz w:val="22"/>
+        </w:rPr>
         <w:t>Educational Posts (generate_edu.py)</w:t>
       </w:r>
     </w:p>
@@ -3423,7 +3598,7 @@
           <w:i w:val="0"/>
           <w:sz w:val="21"/>
         </w:rPr>
-        <w:t>Every image is paired with a caption generated from the same live data. Captions include the key metrics, a call to action, and a fixed set of hashtags.</w:t>
+        <w:t>Every image is paired with a caption generated from the same live data. Captions include the key metrics, a shared call-to-action block, and a fixed set of hashtags.</w:t>
       </w:r>
     </w:p>
     <w:tbl>
@@ -3506,7 +3681,7 @@
                 <w:i w:val="0"/>
                 <w:sz w:val="20"/>
               </w:rPr>
-              <w:t>Balance, gain, monthly avg, win rate, profit factor, pips + hashtags</w:t>
+              <w:t>Balance, gain, monthly avg, win rate, profit factor, pips + CTA + hashtags</w:t>
             </w:r>
           </w:p>
         </w:tc>
@@ -3540,7 +3715,7 @@
                 <w:i w:val="0"/>
                 <w:sz w:val="20"/>
               </w:rPr>
-              <w:t>Last 6 months breakdown with green/red emoji per month</w:t>
+              <w:t>Last 6 months breakdown with green/red emoji per month + CTA + hashtags</w:t>
             </w:r>
           </w:p>
         </w:tc>
@@ -3576,7 +3751,7 @@
                 <w:i w:val="0"/>
                 <w:sz w:val="20"/>
               </w:rPr>
-              <w:t>Equity, balance, daily %, open positions list with profit emoji</w:t>
+              <w:t>Equity, balance, daily %, open positions list with profit emoji + CTA + hashtags</w:t>
             </w:r>
           </w:p>
         </w:tc>
@@ -3610,7 +3785,7 @@
                 <w:i w:val="0"/>
                 <w:sz w:val="20"/>
               </w:rPr>
-              <w:t>Win rate, profit factor, total gain, pips + credibility copy</w:t>
+              <w:t>Win rate, profit factor, total gain, pips + credibility copy + CTA + hashtags</w:t>
             </w:r>
           </w:p>
         </w:tc>
@@ -3646,13 +3821,127 @@
                 <w:i w:val="0"/>
                 <w:sz w:val="20"/>
               </w:rPr>
-              <w:t>Type-specific educational caption with IB link and Telegram CTA</w:t>
+              <w:t>Type-specific educational copy + CTA + edu hashtags</w:t>
             </w:r>
           </w:p>
         </w:tc>
       </w:tr>
     </w:tbl>
     <w:p/>
+    <w:p>
+      <w:pPr>
+        <w:spacing w:before="160" w:after="40"/>
+      </w:pPr>
+      <w:r>
+        <w:rPr>
+          <w:rFonts w:ascii="Calibri" w:hAnsi="Calibri"/>
+          <w:b/>
+          <w:i w:val="0"/>
+          <w:color w:val="444466"/>
+          <w:sz w:val="22"/>
+        </w:rPr>
+        <w:t>Call-to-Action Block (_CTA)</w:t>
+      </w:r>
+    </w:p>
+    <w:p>
+      <w:pPr>
+        <w:spacing w:before="40" w:after="80"/>
+      </w:pPr>
+      <w:r>
+        <w:rPr>
+          <w:rFonts w:ascii="Calibri" w:hAnsi="Calibri"/>
+          <w:b w:val="0"/>
+          <w:i w:val="0"/>
+          <w:sz w:val="21"/>
+        </w:rPr>
+        <w:t>All five caption functions share a single _CTA constant appended at the end of every caption:</w:t>
+      </w:r>
+    </w:p>
+    <w:p>
+      <w:pPr>
+        <w:spacing w:before="0" w:after="0"/>
+        <w:ind w:left="454"/>
+        <w:shd w:val="clear" w:color="auto" w:fill="F2F2F2"/>
+      </w:pPr>
+      <w:r>
+        <w:rPr>
+          <w:rFonts w:ascii="Courier New" w:hAnsi="Courier New"/>
+          <w:b w:val="0"/>
+          <w:i w:val="0"/>
+          <w:color w:val="1A1A2E"/>
+          <w:sz w:val="18"/>
+        </w:rPr>
+        <w:t>📲 Live signals → https://t.me/pandiangk</w:t>
+      </w:r>
+    </w:p>
+    <w:p>
+      <w:pPr>
+        <w:spacing w:before="0" w:after="0"/>
+        <w:ind w:left="454"/>
+        <w:shd w:val="clear" w:color="auto" w:fill="F2F2F2"/>
+      </w:pPr>
+      <w:r>
+        <w:rPr>
+          <w:rFonts w:ascii="Courier New" w:hAnsi="Courier New"/>
+          <w:b w:val="0"/>
+          <w:i w:val="0"/>
+          <w:color w:val="1A1A2E"/>
+          <w:sz w:val="18"/>
+        </w:rPr>
+        <w:t>🌐 Live account → https://vera-level-forex.vercel.app</w:t>
+      </w:r>
+    </w:p>
+    <w:p>
+      <w:pPr>
+        <w:spacing w:before="0" w:after="0"/>
+        <w:ind w:left="454"/>
+        <w:shd w:val="clear" w:color="auto" w:fill="F2F2F2"/>
+      </w:pPr>
+      <w:r>
+        <w:rPr>
+          <w:rFonts w:ascii="Courier New" w:hAnsi="Courier New"/>
+          <w:b w:val="0"/>
+          <w:i w:val="0"/>
+          <w:color w:val="1A1A2E"/>
+          <w:sz w:val="18"/>
+        </w:rPr>
+        <w:t>🏦 Open IC Markets account →</w:t>
+      </w:r>
+    </w:p>
+    <w:p>
+      <w:pPr>
+        <w:spacing w:before="0" w:after="0"/>
+        <w:ind w:left="454"/>
+        <w:shd w:val="clear" w:color="auto" w:fill="F2F2F2"/>
+      </w:pPr>
+      <w:r>
+        <w:rPr>
+          <w:rFonts w:ascii="Courier New" w:hAnsi="Courier New"/>
+          <w:b w:val="0"/>
+          <w:i w:val="0"/>
+          <w:color w:val="1A1A2E"/>
+          <w:sz w:val="18"/>
+        </w:rPr>
+        <w:t>https://icmarkets.com/global/en/?camp=91936</w:t>
+      </w:r>
+    </w:p>
+    <w:p/>
+    <w:p>
+      <w:pPr>
+        <w:spacing w:before="80" w:after="160"/>
+        <w:ind w:left="283" w:right="283"/>
+        <w:shd w:val="clear" w:color="auto" w:fill="E8F4FD"/>
+      </w:pPr>
+      <w:r>
+        <w:rPr>
+          <w:rFonts w:ascii="Calibri" w:hAnsi="Calibri"/>
+          <w:b w:val="0"/>
+          <w:i/>
+          <w:sz w:val="20"/>
+        </w:rPr>
+        <w:t>📌  All three URLs use the full https:// prefix so Instagram renders them as tappable links on mobile. The IC Markets URL includes the IB referral parameter camp=91936.</w:t>
+      </w:r>
+    </w:p>
     <w:p>
       <w:pPr>
         <w:spacing w:before="240" w:after="80"/>
@@ -6711,6 +7000,22 @@
           <w:i w:val="0"/>
           <w:sz w:val="21"/>
         </w:rPr>
+        <w:t>IC Markets referral QR code (camp=91936) is stamped onto the bottom-right corner via PIL.</w:t>
+      </w:r>
+    </w:p>
+    <w:p>
+      <w:pPr>
+        <w:pStyle w:val="ListBullet"/>
+        <w:spacing w:before="20" w:after="20"/>
+        <w:ind w:left="283"/>
+      </w:pPr>
+      <w:r>
+        <w:rPr>
+          <w:rFonts w:ascii="Calibri" w:hAnsi="Calibri"/>
+          <w:b w:val="0"/>
+          <w:i w:val="0"/>
+          <w:sz w:val="21"/>
+        </w:rPr>
         <w:t>PNG is git-committed and pushed to the repo — creating a stable public URL on GitHub's CDN.</w:t>
       </w:r>
     </w:p>
@@ -8746,7 +9051,23 @@
           <w:i w:val="0"/>
           <w:sz w:val="21"/>
         </w:rPr>
-        <w:t>Check IC Markets IB link is still valid (icmarkets.com/?camp=91936).</w:t>
+        <w:t>Check IC Markets IB link is still valid: https://icmarkets.com/global/en/?camp=91936.</w:t>
+      </w:r>
+    </w:p>
+    <w:p>
+      <w:pPr>
+        <w:pStyle w:val="ListBullet"/>
+        <w:spacing w:before="20" w:after="20"/>
+        <w:ind w:left="283"/>
+      </w:pPr>
+      <w:r>
+        <w:rPr>
+          <w:rFonts w:ascii="Calibri" w:hAnsi="Calibri"/>
+          <w:b w:val="0"/>
+          <w:i w:val="0"/>
+          <w:sz w:val="21"/>
+        </w:rPr>
+        <w:t>Verify QR code (instagram/assets/qr-icmarkets.jpg) still scans to the correct referral URL.</w:t>
       </w:r>
     </w:p>
     <w:p>

</xml_diff>